<commit_message>
Add a feed weight to each silo and show the tonnes stored
Each silo gets an optional feed weight (tonnes, from the manufacturer). The
card shows feed stored as the fill percentage of that weight, e.g. "8 t of
20 t feed", the report and /api/pages carry feedWeightTonnes and
feedStoredTonnes for SiloCentral, and the weight is part of the remote
configuration (optional, so older configurations still validate).

Migration 0006 adds a nullable column; existing silos are unchanged.
API reference (Markdown and Word) updated.

Co-Authored-By: Claude Sonnet 5.5 <noreply@anthropic.com>
</commit_message>
<xml_diff>
--- a/docs/api-reference.docx
+++ b/docs/api-reference.docx
@@ -1143,6 +1143,36 @@
           <w:sz w:val="18"/>
           <w:szCs w:val="18"/>
         </w:rPr>
+        <w:t xml:space="preserve">          "feedWeightTonnes": 20,</w:t>
+      </w:r>
+    </w:p>
+    <w:p>
+      <w:pPr>
+        <w:shd w:fill="F3F5F7" w:val="clear"/>
+        <w:spacing w:after="0" w:before="0" w:line="260"/>
+        <w:ind w:left="120" w:right="120"/>
+      </w:pPr>
+      <w:r>
+        <w:rPr>
+          <w:rFonts w:ascii="Consolas" w:cs="Consolas" w:eastAsia="Consolas" w:hAnsi="Consolas"/>
+          <w:sz w:val="18"/>
+          <w:szCs w:val="18"/>
+        </w:rPr>
+        <w:t xml:space="preserve">          "feedStoredTonnes": 12.3,</w:t>
+      </w:r>
+    </w:p>
+    <w:p>
+      <w:pPr>
+        <w:shd w:fill="F3F5F7" w:val="clear"/>
+        <w:spacing w:after="0" w:before="0" w:line="260"/>
+        <w:ind w:left="120" w:right="120"/>
+      </w:pPr>
+      <w:r>
+        <w:rPr>
+          <w:rFonts w:ascii="Consolas" w:cs="Consolas" w:eastAsia="Consolas" w:hAnsi="Consolas"/>
+          <w:sz w:val="18"/>
+          <w:szCs w:val="18"/>
+        </w:rPr>
         <w:t xml:space="preserve">          "lastReadAt": "2026-09-03T02:13:58.000Z"</w:t>
       </w:r>
     </w:p>
@@ -1744,6 +1774,36 @@
           <w:sz w:val="18"/>
           <w:szCs w:val="18"/>
         </w:rPr>
+        <w:t xml:space="preserve">      "feedWeightTonnes": 20,</w:t>
+      </w:r>
+    </w:p>
+    <w:p>
+      <w:pPr>
+        <w:shd w:fill="F3F5F7" w:val="clear"/>
+        <w:spacing w:after="0" w:before="0" w:line="260"/>
+        <w:ind w:left="120" w:right="120"/>
+      </w:pPr>
+      <w:r>
+        <w:rPr>
+          <w:rFonts w:ascii="Consolas" w:cs="Consolas" w:eastAsia="Consolas" w:hAnsi="Consolas"/>
+          <w:sz w:val="18"/>
+          <w:szCs w:val="18"/>
+        </w:rPr>
+        <w:t xml:space="preserve">      "feedStoredTonnes": 12.3,</w:t>
+      </w:r>
+    </w:p>
+    <w:p>
+      <w:pPr>
+        <w:shd w:fill="F3F5F7" w:val="clear"/>
+        <w:spacing w:after="0" w:before="0" w:line="260"/>
+        <w:ind w:left="120" w:right="120"/>
+      </w:pPr>
+      <w:r>
+        <w:rPr>
+          <w:rFonts w:ascii="Consolas" w:cs="Consolas" w:eastAsia="Consolas" w:hAnsi="Consolas"/>
+          <w:sz w:val="18"/>
+          <w:szCs w:val="18"/>
+        </w:rPr>
         <w:t xml:space="preserve">      "lastReadAt": "2026-09-03T02:13:58.000Z"</w:t>
       </w:r>
     </w:p>
@@ -2328,6 +2388,36 @@
           <w:sz w:val="18"/>
           <w:szCs w:val="18"/>
         </w:rPr>
+        <w:t xml:space="preserve">        "feedWeightTonnes": 20,</w:t>
+      </w:r>
+    </w:p>
+    <w:p>
+      <w:pPr>
+        <w:shd w:fill="F3F5F7" w:val="clear"/>
+        <w:spacing w:after="0" w:before="0" w:line="260"/>
+        <w:ind w:left="120" w:right="120"/>
+      </w:pPr>
+      <w:r>
+        <w:rPr>
+          <w:rFonts w:ascii="Consolas" w:cs="Consolas" w:eastAsia="Consolas" w:hAnsi="Consolas"/>
+          <w:sz w:val="18"/>
+          <w:szCs w:val="18"/>
+        </w:rPr>
+        <w:t xml:space="preserve">        "feedStoredTonnes": 12.3,</w:t>
+      </w:r>
+    </w:p>
+    <w:p>
+      <w:pPr>
+        <w:shd w:fill="F3F5F7" w:val="clear"/>
+        <w:spacing w:after="0" w:before="0" w:line="260"/>
+        <w:ind w:left="120" w:right="120"/>
+      </w:pPr>
+      <w:r>
+        <w:rPr>
+          <w:rFonts w:ascii="Consolas" w:cs="Consolas" w:eastAsia="Consolas" w:hAnsi="Consolas"/>
+          <w:sz w:val="18"/>
+          <w:szCs w:val="18"/>
+        </w:rPr>
         <w:t xml:space="preserve">        "lastReadAt": "2026-09-03T02:13:58.000Z"</w:t>
       </w:r>
     </w:p>
@@ -3645,7 +3735,43 @@
         <w:t xml:space="preserve">uid</w:t>
       </w:r>
       <w:r>
-        <w:t xml:space="preserve">, so a rename is a rename and not a delete plus an add. Alarm levels are percentages from 0 to 100 on the wire. Both ends validate the same schema, so an invalid configuration cannot be saved or applied.</w:t>
+        <w:t xml:space="preserve">, so a rename is a rename and not a delete plus an add. Alarm levels are percentages from 0 to 100 on the wire. A silo's optional </w:t>
+      </w:r>
+      <w:r>
+        <w:rPr>
+          <w:rFonts w:ascii="Consolas" w:cs="Consolas" w:eastAsia="Consolas" w:hAnsi="Consolas"/>
+          <w:sz w:val="20"/>
+          <w:szCs w:val="20"/>
+          <w:shd w:fill="EEF1F4" w:val="clear"/>
+        </w:rPr>
+        <w:t xml:space="preserve">feedWeightTonnes</w:t>
+      </w:r>
+      <w:r>
+        <w:t xml:space="preserve"> (tonnes, above zero, or </w:t>
+      </w:r>
+      <w:r>
+        <w:rPr>
+          <w:rFonts w:ascii="Consolas" w:cs="Consolas" w:eastAsia="Consolas" w:hAnsi="Consolas"/>
+          <w:sz w:val="20"/>
+          <w:szCs w:val="20"/>
+          <w:shd w:fill="EEF1F4" w:val="clear"/>
+        </w:rPr>
+        <w:t xml:space="preserve">null</w:t>
+      </w:r>
+      <w:r>
+        <w:t xml:space="preserve">) travels with the rest of its settings; a configuration without it is read as </w:t>
+      </w:r>
+      <w:r>
+        <w:rPr>
+          <w:rFonts w:ascii="Consolas" w:cs="Consolas" w:eastAsia="Consolas" w:hAnsi="Consolas"/>
+          <w:sz w:val="20"/>
+          <w:szCs w:val="20"/>
+          <w:shd w:fill="EEF1F4" w:val="clear"/>
+        </w:rPr>
+        <w:t xml:space="preserve">null</w:t>
+      </w:r>
+      <w:r>
+        <w:t xml:space="preserve">. Both ends validate the same schema, so an invalid configuration cannot be saved or applied.</w:t>
       </w:r>
     </w:p>
     <w:p>
@@ -5145,6 +5271,226 @@
             </w:r>
             <w:r>
               <w:t xml:space="preserve">.</w:t>
+            </w:r>
+          </w:p>
+        </w:tc>
+      </w:tr>
+      <w:tr>
+        <w:tc>
+          <w:tcPr>
+            <w:tcW w:type="dxa" w:w="3008"/>
+            <w:tcBorders>
+              <w:top w:val="single" w:color="BFC5CC" w:sz="4"/>
+              <w:left w:val="single" w:color="BFC5CC" w:sz="4"/>
+              <w:bottom w:val="single" w:color="BFC5CC" w:sz="4"/>
+              <w:right w:val="single" w:color="BFC5CC" w:sz="4"/>
+            </w:tcBorders>
+            <w:tcMar>
+              <w:top w:type="dxa" w:w="60"/>
+              <w:left w:type="dxa" w:w="100"/>
+              <w:bottom w:type="dxa" w:w="60"/>
+              <w:right w:type="dxa" w:w="100"/>
+            </w:tcMar>
+          </w:tcPr>
+          <w:p>
+            <w:r>
+              <w:rPr>
+                <w:rFonts w:ascii="Consolas" w:cs="Consolas" w:eastAsia="Consolas" w:hAnsi="Consolas"/>
+                <w:sz w:val="20"/>
+                <w:szCs w:val="20"/>
+                <w:shd w:fill="EEF1F4" w:val="clear"/>
+              </w:rPr>
+              <w:t xml:space="preserve">feedWeightTonnes</w:t>
+            </w:r>
+          </w:p>
+        </w:tc>
+        <w:tc>
+          <w:tcPr>
+            <w:tcW w:type="dxa" w:w="3008"/>
+            <w:tcBorders>
+              <w:top w:val="single" w:color="BFC5CC" w:sz="4"/>
+              <w:left w:val="single" w:color="BFC5CC" w:sz="4"/>
+              <w:bottom w:val="single" w:color="BFC5CC" w:sz="4"/>
+              <w:right w:val="single" w:color="BFC5CC" w:sz="4"/>
+            </w:tcBorders>
+            <w:tcMar>
+              <w:top w:type="dxa" w:w="60"/>
+              <w:left w:type="dxa" w:w="100"/>
+              <w:bottom w:type="dxa" w:w="60"/>
+              <w:right w:type="dxa" w:w="100"/>
+            </w:tcMar>
+          </w:tcPr>
+          <w:p>
+            <w:r>
+              <w:rPr>
+                <w:rFonts w:ascii="Consolas" w:cs="Consolas" w:eastAsia="Consolas" w:hAnsi="Consolas"/>
+                <w:sz w:val="20"/>
+                <w:szCs w:val="20"/>
+                <w:shd w:fill="EEF1F4" w:val="clear"/>
+              </w:rPr>
+              <w:t xml:space="preserve">number | null</w:t>
+            </w:r>
+          </w:p>
+        </w:tc>
+        <w:tc>
+          <w:tcPr>
+            <w:tcW w:type="dxa" w:w="3008"/>
+            <w:tcBorders>
+              <w:top w:val="single" w:color="BFC5CC" w:sz="4"/>
+              <w:left w:val="single" w:color="BFC5CC" w:sz="4"/>
+              <w:bottom w:val="single" w:color="BFC5CC" w:sz="4"/>
+              <w:right w:val="single" w:color="BFC5CC" w:sz="4"/>
+            </w:tcBorders>
+            <w:tcMar>
+              <w:top w:type="dxa" w:w="60"/>
+              <w:left w:type="dxa" w:w="100"/>
+              <w:bottom w:type="dxa" w:w="60"/>
+              <w:right w:type="dxa" w:w="100"/>
+            </w:tcMar>
+          </w:tcPr>
+          <w:p>
+            <w:r>
+              <w:t xml:space="preserve">The manufacturer's stated weight of feed when the silo is full, in tonnes, as set on the silo's Setup form. </w:t>
+            </w:r>
+            <w:r>
+              <w:rPr>
+                <w:rFonts w:ascii="Consolas" w:cs="Consolas" w:eastAsia="Consolas" w:hAnsi="Consolas"/>
+                <w:sz w:val="20"/>
+                <w:szCs w:val="20"/>
+                <w:shd w:fill="EEF1F4" w:val="clear"/>
+              </w:rPr>
+              <w:t xml:space="preserve">null</w:t>
+            </w:r>
+            <w:r>
+              <w:t xml:space="preserve"> when not set. Separate from </w:t>
+            </w:r>
+            <w:r>
+              <w:rPr>
+                <w:rFonts w:ascii="Consolas" w:cs="Consolas" w:eastAsia="Consolas" w:hAnsi="Consolas"/>
+                <w:sz w:val="20"/>
+                <w:szCs w:val="20"/>
+                <w:shd w:fill="EEF1F4" w:val="clear"/>
+              </w:rPr>
+              <w:t xml:space="preserve">capacity</w:t>
+            </w:r>
+            <w:r>
+              <w:t xml:space="preserve">, which describes the sensor reading. Absent from sites running an older SiloMon.</w:t>
+            </w:r>
+          </w:p>
+        </w:tc>
+      </w:tr>
+      <w:tr>
+        <w:tc>
+          <w:tcPr>
+            <w:tcW w:type="dxa" w:w="3008"/>
+            <w:tcBorders>
+              <w:top w:val="single" w:color="BFC5CC" w:sz="4"/>
+              <w:left w:val="single" w:color="BFC5CC" w:sz="4"/>
+              <w:bottom w:val="single" w:color="BFC5CC" w:sz="4"/>
+              <w:right w:val="single" w:color="BFC5CC" w:sz="4"/>
+            </w:tcBorders>
+            <w:tcMar>
+              <w:top w:type="dxa" w:w="60"/>
+              <w:left w:type="dxa" w:w="100"/>
+              <w:bottom w:type="dxa" w:w="60"/>
+              <w:right w:type="dxa" w:w="100"/>
+            </w:tcMar>
+          </w:tcPr>
+          <w:p>
+            <w:r>
+              <w:rPr>
+                <w:rFonts w:ascii="Consolas" w:cs="Consolas" w:eastAsia="Consolas" w:hAnsi="Consolas"/>
+                <w:sz w:val="20"/>
+                <w:szCs w:val="20"/>
+                <w:shd w:fill="EEF1F4" w:val="clear"/>
+              </w:rPr>
+              <w:t xml:space="preserve">feedStoredTonnes</w:t>
+            </w:r>
+          </w:p>
+        </w:tc>
+        <w:tc>
+          <w:tcPr>
+            <w:tcW w:type="dxa" w:w="3008"/>
+            <w:tcBorders>
+              <w:top w:val="single" w:color="BFC5CC" w:sz="4"/>
+              <w:left w:val="single" w:color="BFC5CC" w:sz="4"/>
+              <w:bottom w:val="single" w:color="BFC5CC" w:sz="4"/>
+              <w:right w:val="single" w:color="BFC5CC" w:sz="4"/>
+            </w:tcBorders>
+            <w:tcMar>
+              <w:top w:type="dxa" w:w="60"/>
+              <w:left w:type="dxa" w:w="100"/>
+              <w:bottom w:type="dxa" w:w="60"/>
+              <w:right w:type="dxa" w:w="100"/>
+            </w:tcMar>
+          </w:tcPr>
+          <w:p>
+            <w:r>
+              <w:rPr>
+                <w:rFonts w:ascii="Consolas" w:cs="Consolas" w:eastAsia="Consolas" w:hAnsi="Consolas"/>
+                <w:sz w:val="20"/>
+                <w:szCs w:val="20"/>
+                <w:shd w:fill="EEF1F4" w:val="clear"/>
+              </w:rPr>
+              <w:t xml:space="preserve">number | null</w:t>
+            </w:r>
+          </w:p>
+        </w:tc>
+        <w:tc>
+          <w:tcPr>
+            <w:tcW w:type="dxa" w:w="3008"/>
+            <w:tcBorders>
+              <w:top w:val="single" w:color="BFC5CC" w:sz="4"/>
+              <w:left w:val="single" w:color="BFC5CC" w:sz="4"/>
+              <w:bottom w:val="single" w:color="BFC5CC" w:sz="4"/>
+              <w:right w:val="single" w:color="BFC5CC" w:sz="4"/>
+            </w:tcBorders>
+            <w:tcMar>
+              <w:top w:type="dxa" w:w="60"/>
+              <w:left w:type="dxa" w:w="100"/>
+              <w:bottom w:type="dxa" w:w="60"/>
+              <w:right w:type="dxa" w:w="100"/>
+            </w:tcMar>
+          </w:tcPr>
+          <w:p>
+            <w:r>
+              <w:t xml:space="preserve">Tonnes of feed currently stored: </w:t>
+            </w:r>
+            <w:r>
+              <w:rPr>
+                <w:rFonts w:ascii="Consolas" w:cs="Consolas" w:eastAsia="Consolas" w:hAnsi="Consolas"/>
+                <w:sz w:val="20"/>
+                <w:szCs w:val="20"/>
+                <w:shd w:fill="EEF1F4" w:val="clear"/>
+              </w:rPr>
+              <w:t xml:space="preserve">percent</w:t>
+            </w:r>
+            <w:r>
+              <w:t xml:space="preserve"> (limited to 0–100) × </w:t>
+            </w:r>
+            <w:r>
+              <w:rPr>
+                <w:rFonts w:ascii="Consolas" w:cs="Consolas" w:eastAsia="Consolas" w:hAnsi="Consolas"/>
+                <w:sz w:val="20"/>
+                <w:szCs w:val="20"/>
+                <w:shd w:fill="EEF1F4" w:val="clear"/>
+              </w:rPr>
+              <w:t xml:space="preserve">feedWeightTonnes</w:t>
+            </w:r>
+            <w:r>
+              <w:t xml:space="preserve"> ÷ 100. </w:t>
+            </w:r>
+            <w:r>
+              <w:rPr>
+                <w:rFonts w:ascii="Consolas" w:cs="Consolas" w:eastAsia="Consolas" w:hAnsi="Consolas"/>
+                <w:sz w:val="20"/>
+                <w:szCs w:val="20"/>
+                <w:shd w:fill="EEF1F4" w:val="clear"/>
+              </w:rPr>
+              <w:t xml:space="preserve">null</w:t>
+            </w:r>
+            <w:r>
+              <w:t xml:space="preserve"> when no feed weight is set. Absent from sites running an older SiloMon.</w:t>
             </w:r>
           </w:p>
         </w:tc>

</xml_diff>

<commit_message>
Correct where the reporting API key is set
It is the REPORTING_API_KEY environment variable, not a Setup page field.

Co-Authored-By: Claude Sonnet 5.5 <noreply@anthropic.com>
</commit_message>
<xml_diff>
--- a/docs/api-reference.docx
+++ b/docs/api-reference.docx
@@ -510,7 +510,31 @@
               <w:t xml:space="preserve">into</w:t>
             </w:r>
             <w:r>
-              <w:t xml:space="preserve"> a SiloMon site. Set on that site's own Setup page. Guards </w:t>
+              <w:t xml:space="preserve"> a SiloMon site. You choose it and set it as the </w:t>
+            </w:r>
+            <w:r>
+              <w:rPr>
+                <w:rFonts w:ascii="Consolas" w:cs="Consolas" w:eastAsia="Consolas" w:hAnsi="Consolas"/>
+                <w:sz w:val="20"/>
+                <w:szCs w:val="20"/>
+                <w:shd w:fill="EEF1F4" w:val="clear"/>
+              </w:rPr>
+              <w:t xml:space="preserve">REPORTING_API_KEY</w:t>
+            </w:r>
+            <w:r>
+              <w:t xml:space="preserve"> environment variable on that site's dashboard (the </w:t>
+            </w:r>
+            <w:r>
+              <w:rPr>
+                <w:rFonts w:ascii="Consolas" w:cs="Consolas" w:eastAsia="Consolas" w:hAnsi="Consolas"/>
+                <w:sz w:val="20"/>
+                <w:szCs w:val="20"/>
+                <w:shd w:fill="EEF1F4" w:val="clear"/>
+              </w:rPr>
+              <w:t xml:space="preserve">.env</w:t>
+            </w:r>
+            <w:r>
+              <w:t xml:space="preserve"> file on a Pi, the service variables on Railway), then restart the dashboard. It isn't on the Setup page. Guards </w:t>
             </w:r>
             <w:r>
               <w:rPr>

</xml_diff>

<commit_message>
Document the SiloCentral reporting API for outside developers
New docs/customer-api.md (and a Word copy): authentication, the three
endpoints, parameters, limits, CSV format, errors and examples. The main API
reference points to it and mentions the customer key.

Co-Authored-By: Claude Sonnet 5.5 <noreply@anthropic.com>
</commit_message>
<xml_diff>
--- a/docs/api-reference.docx
+++ b/docs/api-reference.docx
@@ -248,6 +248,98 @@
                 <w:b/>
                 <w:bCs/>
               </w:rPr>
+              <w:t xml:space="preserve">SiloCentral serves to outside readers</w:t>
+            </w:r>
+          </w:p>
+        </w:tc>
+        <w:tc>
+          <w:tcPr>
+            <w:tcW w:type="dxa" w:w="6426"/>
+            <w:tcBorders>
+              <w:top w:val="single" w:color="BFC5CC" w:sz="4"/>
+              <w:left w:val="single" w:color="BFC5CC" w:sz="4"/>
+              <w:bottom w:val="single" w:color="BFC5CC" w:sz="4"/>
+              <w:right w:val="single" w:color="BFC5CC" w:sz="4"/>
+            </w:tcBorders>
+            <w:tcMar>
+              <w:top w:type="dxa" w:w="60"/>
+              <w:left w:type="dxa" w:w="100"/>
+              <w:bottom w:type="dxa" w:w="60"/>
+              <w:right w:type="dxa" w:w="100"/>
+            </w:tcMar>
+          </w:tcPr>
+          <w:p>
+            <w:r>
+              <w:rPr>
+                <w:rFonts w:ascii="Consolas" w:cs="Consolas" w:eastAsia="Consolas" w:hAnsi="Consolas"/>
+                <w:sz w:val="20"/>
+                <w:szCs w:val="20"/>
+                <w:shd w:fill="EEF1F4" w:val="clear"/>
+              </w:rPr>
+              <w:t xml:space="preserve">GET /api/v1/sites</w:t>
+            </w:r>
+            <w:r>
+              <w:t xml:space="preserve">, </w:t>
+            </w:r>
+            <w:r>
+              <w:rPr>
+                <w:rFonts w:ascii="Consolas" w:cs="Consolas" w:eastAsia="Consolas" w:hAnsi="Consolas"/>
+                <w:sz w:val="20"/>
+                <w:szCs w:val="20"/>
+                <w:shd w:fill="EEF1F4" w:val="clear"/>
+              </w:rPr>
+              <w:t xml:space="preserve">GET /api/v1/levels</w:t>
+            </w:r>
+            <w:r>
+              <w:t xml:space="preserve">, </w:t>
+            </w:r>
+            <w:r>
+              <w:rPr>
+                <w:rFonts w:ascii="Consolas" w:cs="Consolas" w:eastAsia="Consolas" w:hAnsi="Consolas"/>
+                <w:sz w:val="20"/>
+                <w:szCs w:val="20"/>
+                <w:shd w:fill="EEF1F4" w:val="clear"/>
+              </w:rPr>
+              <w:t xml:space="preserve">GET /api/v1/history</w:t>
+            </w:r>
+            <w:r>
+              <w:t xml:space="preserve"> — see </w:t>
+            </w:r>
+            <w:r>
+              <w:rPr>
+                <w:rFonts w:ascii="Consolas" w:cs="Consolas" w:eastAsia="Consolas" w:hAnsi="Consolas"/>
+                <w:sz w:val="20"/>
+                <w:szCs w:val="20"/>
+                <w:shd w:fill="EEF1F4" w:val="clear"/>
+              </w:rPr>
+              <w:t xml:space="preserve">customer-api.md</w:t>
+            </w:r>
+          </w:p>
+        </w:tc>
+      </w:tr>
+      <w:tr>
+        <w:tc>
+          <w:tcPr>
+            <w:tcW w:type="dxa" w:w="2600"/>
+            <w:tcBorders>
+              <w:top w:val="single" w:color="BFC5CC" w:sz="4"/>
+              <w:left w:val="single" w:color="BFC5CC" w:sz="4"/>
+              <w:bottom w:val="single" w:color="BFC5CC" w:sz="4"/>
+              <w:right w:val="single" w:color="BFC5CC" w:sz="4"/>
+            </w:tcBorders>
+            <w:tcMar>
+              <w:top w:type="dxa" w:w="60"/>
+              <w:left w:type="dxa" w:w="100"/>
+              <w:bottom w:type="dxa" w:w="60"/>
+              <w:right w:type="dxa" w:w="100"/>
+            </w:tcMar>
+          </w:tcPr>
+          <w:p>
+            <w:r>
+              <w:rPr>
+                <w:b/>
+                <w:bCs/>
+              </w:rPr>
               <w:t xml:space="preserve">Format</w:t>
             </w:r>
           </w:p>
@@ -321,7 +413,7 @@
         <w:spacing w:after="140" w:line="300"/>
       </w:pPr>
       <w:r>
-        <w:t xml:space="preserve">Two separate keys, two separate directions. Neither is a shared master key — losing one exposes exactly one site.</w:t>
+        <w:t xml:space="preserve">Separate keys for separate jobs. None of them is a shared master key: a reporting key or a site key exposes one site, and a customer key exposes only the sites its customer was granted.</w:t>
       </w:r>
     </w:p>
     <w:tbl>
@@ -671,6 +763,108 @@
             </w:r>
             <w:r>
               <w:t xml:space="preserve"> endpoints.</w:t>
+            </w:r>
+          </w:p>
+        </w:tc>
+      </w:tr>
+      <w:tr>
+        <w:tc>
+          <w:tcPr>
+            <w:tcW w:type="dxa" w:w="3008"/>
+            <w:tcBorders>
+              <w:top w:val="single" w:color="BFC5CC" w:sz="4"/>
+              <w:left w:val="single" w:color="BFC5CC" w:sz="4"/>
+              <w:bottom w:val="single" w:color="BFC5CC" w:sz="4"/>
+              <w:right w:val="single" w:color="BFC5CC" w:sz="4"/>
+            </w:tcBorders>
+            <w:tcMar>
+              <w:top w:type="dxa" w:w="60"/>
+              <w:left w:type="dxa" w:w="100"/>
+              <w:bottom w:type="dxa" w:w="60"/>
+              <w:right w:type="dxa" w:w="100"/>
+            </w:tcMar>
+          </w:tcPr>
+          <w:p>
+            <w:r>
+              <w:rPr>
+                <w:b/>
+                <w:bCs/>
+              </w:rPr>
+              <w:t xml:space="preserve">Customer key</w:t>
+            </w:r>
+          </w:p>
+        </w:tc>
+        <w:tc>
+          <w:tcPr>
+            <w:tcW w:type="dxa" w:w="3008"/>
+            <w:tcBorders>
+              <w:top w:val="single" w:color="BFC5CC" w:sz="4"/>
+              <w:left w:val="single" w:color="BFC5CC" w:sz="4"/>
+              <w:bottom w:val="single" w:color="BFC5CC" w:sz="4"/>
+              <w:right w:val="single" w:color="BFC5CC" w:sz="4"/>
+            </w:tcBorders>
+            <w:tcMar>
+              <w:top w:type="dxa" w:w="60"/>
+              <w:left w:type="dxa" w:w="100"/>
+              <w:bottom w:type="dxa" w:w="60"/>
+              <w:right w:type="dxa" w:w="100"/>
+            </w:tcMar>
+          </w:tcPr>
+          <w:p>
+            <w:r>
+              <w:rPr>
+                <w:rFonts w:ascii="Consolas" w:cs="Consolas" w:eastAsia="Consolas" w:hAnsi="Consolas"/>
+                <w:sz w:val="20"/>
+                <w:szCs w:val="20"/>
+                <w:shd w:fill="EEF1F4" w:val="clear"/>
+              </w:rPr>
+              <w:t xml:space="preserve">Authorization: Bearer sck_...</w:t>
+            </w:r>
+          </w:p>
+        </w:tc>
+        <w:tc>
+          <w:tcPr>
+            <w:tcW w:type="dxa" w:w="3008"/>
+            <w:tcBorders>
+              <w:top w:val="single" w:color="BFC5CC" w:sz="4"/>
+              <w:left w:val="single" w:color="BFC5CC" w:sz="4"/>
+              <w:bottom w:val="single" w:color="BFC5CC" w:sz="4"/>
+              <w:right w:val="single" w:color="BFC5CC" w:sz="4"/>
+            </w:tcBorders>
+            <w:tcMar>
+              <w:top w:type="dxa" w:w="60"/>
+              <w:left w:type="dxa" w:w="100"/>
+              <w:bottom w:type="dxa" w:w="60"/>
+              <w:right w:type="dxa" w:w="100"/>
+            </w:tcMar>
+          </w:tcPr>
+          <w:p>
+            <w:r>
+              <w:t xml:space="preserve">One per customer, made by an admin on SiloCentral's Customers &amp; API page and shown once. Gives read-only access to the sites that customer was granted. Guards </w:t>
+            </w:r>
+            <w:r>
+              <w:rPr>
+                <w:rFonts w:ascii="Consolas" w:cs="Consolas" w:eastAsia="Consolas" w:hAnsi="Consolas"/>
+                <w:sz w:val="20"/>
+                <w:szCs w:val="20"/>
+                <w:shd w:fill="EEF1F4" w:val="clear"/>
+              </w:rPr>
+              <w:t xml:space="preserve">/api/v1/*</w:t>
+            </w:r>
+            <w:r>
+              <w:t xml:space="preserve">, which is documented separately in </w:t>
+            </w:r>
+            <w:r>
+              <w:rPr>
+                <w:rFonts w:ascii="Consolas" w:cs="Consolas" w:eastAsia="Consolas" w:hAnsi="Consolas"/>
+                <w:sz w:val="20"/>
+                <w:szCs w:val="20"/>
+                <w:shd w:fill="EEF1F4" w:val="clear"/>
+              </w:rPr>
+              <w:t xml:space="preserve">customer-api.md</w:t>
+            </w:r>
+            <w:r>
+              <w:t xml:space="preserve">.</w:t>
             </w:r>
           </w:p>
         </w:tc>

</xml_diff>

<commit_message>
Add a complete SiloCentral API reference and an OpenAPI description
docs/silocentral-api.md gathers everything SiloCentral serves, by caller:
the customer reporting API, the site API (ingest, heartbeat, configuration
import/fetch/acknowledge, with the full configuration document rules) and
the dashboard CSV downloads. docs/silocentral-openapi.yaml describes the
reporting and site APIs for Postman, Swagger UI or code generators; it
validates as OpenAPI 3.0.3. Word copies regenerated.

Co-Authored-By: Claude Sonnet 5.5 <noreply@anthropic.com>
</commit_message>
<xml_diff>
--- a/docs/api-reference.docx
+++ b/docs/api-reference.docx
@@ -394,6 +394,30 @@
           <w:shd w:fill="EEF1F4" w:val="clear"/>
         </w:rPr>
         <w:t xml:space="preserve">api-reference.docx</w:t>
+      </w:r>
+      <w:r>
+        <w:t xml:space="preserve">. Everything SiloCentral serves, gathered by caller, is in </w:t>
+      </w:r>
+      <w:r>
+        <w:rPr>
+          <w:rFonts w:ascii="Consolas" w:cs="Consolas" w:eastAsia="Consolas" w:hAnsi="Consolas"/>
+          <w:sz w:val="20"/>
+          <w:szCs w:val="20"/>
+          <w:shd w:fill="EEF1F4" w:val="clear"/>
+        </w:rPr>
+        <w:t xml:space="preserve">silocentral-api.md</w:t>
+      </w:r>
+      <w:r>
+        <w:t xml:space="preserve">, with an OpenAPI description in </w:t>
+      </w:r>
+      <w:r>
+        <w:rPr>
+          <w:rFonts w:ascii="Consolas" w:cs="Consolas" w:eastAsia="Consolas" w:hAnsi="Consolas"/>
+          <w:sz w:val="20"/>
+          <w:szCs w:val="20"/>
+          <w:shd w:fill="EEF1F4" w:val="clear"/>
+        </w:rPr>
+        <w:t xml:space="preserve">silocentral-openapi.yaml</w:t>
       </w:r>
       <w:r>
         <w:t xml:space="preserve">.</w:t>

</xml_diff>

<commit_message>
Polish the Word copies of the API docs
Checked by rendering through Word: code inside bold text no longer shows
literal backticks, code in headings matches the heading size, and a long
JSON example no longer wraps awkwardly.

Co-Authored-By: Claude Sonnet 5.5 <noreply@anthropic.com>
</commit_message>
<xml_diff>
--- a/docs/api-reference.docx
+++ b/docs/api-reference.docx
@@ -8,6 +8,12 @@
         <w:spacing w:after="120" w:before="0"/>
       </w:pPr>
       <w:r>
+        <w:rPr>
+          <w:b/>
+          <w:bCs/>
+          <w:sz w:val="40"/>
+          <w:szCs w:val="40"/>
+        </w:rPr>
         <w:t xml:space="preserve">Silo Telemetry API — Reference</w:t>
       </w:r>
     </w:p>
@@ -429,6 +435,12 @@
         <w:spacing w:after="120" w:before="280"/>
       </w:pPr>
       <w:r>
+        <w:rPr>
+          <w:b/>
+          <w:bCs/>
+          <w:sz w:val="30"/>
+          <w:szCs w:val="30"/>
+        </w:rPr>
         <w:t xml:space="preserve">Auth, at a glance</w:t>
       </w:r>
     </w:p>
@@ -986,6 +998,12 @@
         <w:spacing w:after="120" w:before="280"/>
       </w:pPr>
       <w:r>
+        <w:rPr>
+          <w:b/>
+          <w:bCs/>
+          <w:sz w:val="30"/>
+          <w:szCs w:val="30"/>
+        </w:rPr>
         <w:t xml:space="preserve">SiloMon — per-site API</w:t>
       </w:r>
     </w:p>
@@ -1005,9 +1023,10 @@
       <w:r>
         <w:rPr>
           <w:rFonts w:ascii="Consolas" w:cs="Consolas" w:eastAsia="Consolas" w:hAnsi="Consolas"/>
-          <w:sz w:val="20"/>
-          <w:szCs w:val="20"/>
-          <w:shd w:fill="EEF1F4" w:val="clear"/>
+          <w:b/>
+          <w:bCs/>
+          <w:sz w:val="24"/>
+          <w:szCs w:val="24"/>
         </w:rPr>
         <w:t xml:space="preserve">GET /api/report</w:t>
       </w:r>
@@ -1765,9 +1784,10 @@
       <w:r>
         <w:rPr>
           <w:rFonts w:ascii="Consolas" w:cs="Consolas" w:eastAsia="Consolas" w:hAnsi="Consolas"/>
-          <w:sz w:val="20"/>
-          <w:szCs w:val="20"/>
-          <w:shd w:fill="EEF1F4" w:val="clear"/>
+          <w:b/>
+          <w:bCs/>
+          <w:sz w:val="24"/>
+          <w:szCs w:val="24"/>
         </w:rPr>
         <w:t xml:space="preserve">GET /api/pages/{slug}</w:t>
       </w:r>
@@ -2309,6 +2329,12 @@
         <w:spacing w:after="120" w:before="280"/>
       </w:pPr>
       <w:r>
+        <w:rPr>
+          <w:b/>
+          <w:bCs/>
+          <w:sz w:val="30"/>
+          <w:szCs w:val="30"/>
+        </w:rPr>
         <w:t xml:space="preserve">SiloCentral — aggregation API</w:t>
       </w:r>
     </w:p>
@@ -2328,9 +2354,10 @@
       <w:r>
         <w:rPr>
           <w:rFonts w:ascii="Consolas" w:cs="Consolas" w:eastAsia="Consolas" w:hAnsi="Consolas"/>
-          <w:sz w:val="20"/>
-          <w:szCs w:val="20"/>
-          <w:shd w:fill="EEF1F4" w:val="clear"/>
+          <w:b/>
+          <w:bCs/>
+          <w:sz w:val="24"/>
+          <w:szCs w:val="24"/>
         </w:rPr>
         <w:t xml:space="preserve">POST /api/ingest</w:t>
       </w:r>
@@ -3097,9 +3124,10 @@
       <w:r>
         <w:rPr>
           <w:rFonts w:ascii="Consolas" w:cs="Consolas" w:eastAsia="Consolas" w:hAnsi="Consolas"/>
-          <w:sz w:val="20"/>
-          <w:szCs w:val="20"/>
-          <w:shd w:fill="EEF1F4" w:val="clear"/>
+          <w:b/>
+          <w:bCs/>
+          <w:sz w:val="24"/>
+          <w:szCs w:val="24"/>
         </w:rPr>
         <w:t xml:space="preserve">POST /api/heartbeat</w:t>
       </w:r>
@@ -3786,6 +3814,12 @@
         <w:spacing w:after="120" w:before="280"/>
       </w:pPr>
       <w:r>
+        <w:rPr>
+          <w:b/>
+          <w:bCs/>
+          <w:sz w:val="30"/>
+          <w:szCs w:val="30"/>
+        </w:rPr>
         <w:t xml:space="preserve">Remote management</w:t>
       </w:r>
     </w:p>
@@ -4024,26 +4058,39 @@
       <w:r>
         <w:rPr>
           <w:rFonts w:ascii="Consolas" w:cs="Consolas" w:eastAsia="Consolas" w:hAnsi="Consolas"/>
+          <w:b/>
+          <w:bCs/>
+          <w:sz w:val="24"/>
+          <w:szCs w:val="24"/>
+        </w:rPr>
+        <w:t xml:space="preserve">GET /api/config</w:t>
+      </w:r>
+    </w:p>
+    <w:p>
+      <w:pPr>
+        <w:spacing w:after="140" w:line="300"/>
+      </w:pPr>
+      <w:r>
+        <w:rPr>
+          <w:b/>
+          <w:bCs/>
+        </w:rPr>
+        <w:t xml:space="preserve">Auth:</w:t>
+      </w:r>
+      <w:r>
+        <w:t xml:space="preserve"> Bearer token required (per-site key). Returns the managed configuration: </w:t>
+      </w:r>
+      <w:r>
+        <w:rPr>
+          <w:rFonts w:ascii="Consolas" w:cs="Consolas" w:eastAsia="Consolas" w:hAnsi="Consolas"/>
           <w:sz w:val="20"/>
           <w:szCs w:val="20"/>
           <w:shd w:fill="EEF1F4" w:val="clear"/>
         </w:rPr>
-        <w:t xml:space="preserve">GET /api/config</w:t>
-      </w:r>
-    </w:p>
-    <w:p>
-      <w:pPr>
-        <w:spacing w:after="140" w:line="300"/>
-      </w:pPr>
-      <w:r>
-        <w:rPr>
-          <w:b/>
-          <w:bCs/>
-        </w:rPr>
-        <w:t xml:space="preserve">Auth:</w:t>
-      </w:r>
-      <w:r>
-        <w:t xml:space="preserve"> Bearer token required (per-site key). Returns the managed configuration: </w:t>
+        <w:t xml:space="preserve">{ "version": 11, "pages": [ ... ], "silos": [ ... ] }</w:t>
+      </w:r>
+      <w:r>
+        <w:t xml:space="preserve">. </w:t>
       </w:r>
       <w:r>
         <w:rPr>
@@ -4052,10 +4099,41 @@
           <w:szCs w:val="20"/>
           <w:shd w:fill="EEF1F4" w:val="clear"/>
         </w:rPr>
-        <w:t xml:space="preserve">{ "version": 11, "pages": [ ... ], "silos": [ ... ] }</w:t>
-      </w:r>
-      <w:r>
-        <w:t xml:space="preserve">. </w:t>
+        <w:t xml:space="preserve">404</w:t>
+      </w:r>
+      <w:r>
+        <w:t xml:space="preserve"> if the site is not managed.</w:t>
+      </w:r>
+    </w:p>
+    <w:p>
+      <w:pPr>
+        <w:pStyle w:val="Heading3"/>
+        <w:spacing w:after="120" w:before="280"/>
+      </w:pPr>
+      <w:r>
+        <w:rPr>
+          <w:rFonts w:ascii="Consolas" w:cs="Consolas" w:eastAsia="Consolas" w:hAnsi="Consolas"/>
+          <w:b/>
+          <w:bCs/>
+          <w:sz w:val="24"/>
+          <w:szCs w:val="24"/>
+        </w:rPr>
+        <w:t xml:space="preserve">POST /api/config/import</w:t>
+      </w:r>
+    </w:p>
+    <w:p>
+      <w:pPr>
+        <w:spacing w:after="140" w:line="300"/>
+      </w:pPr>
+      <w:r>
+        <w:rPr>
+          <w:b/>
+          <w:bCs/>
+        </w:rPr>
+        <w:t xml:space="preserve">Auth:</w:t>
+      </w:r>
+      <w:r>
+        <w:t xml:space="preserve"> Bearer token required. Body: the site's configuration (</w:t>
       </w:r>
       <w:r>
         <w:rPr>
@@ -4064,17 +4142,11 @@
           <w:szCs w:val="20"/>
           <w:shd w:fill="EEF1F4" w:val="clear"/>
         </w:rPr>
-        <w:t xml:space="preserve">404</w:t>
-      </w:r>
-      <w:r>
-        <w:t xml:space="preserve"> if the site is not managed.</w:t>
-      </w:r>
-    </w:p>
-    <w:p>
-      <w:pPr>
-        <w:pStyle w:val="Heading3"/>
-        <w:spacing w:after="120" w:before="280"/>
-      </w:pPr>
+        <w:t xml:space="preserve">pages</w:t>
+      </w:r>
+      <w:r>
+        <w:t xml:space="preserve">, </w:t>
+      </w:r>
       <w:r>
         <w:rPr>
           <w:rFonts w:ascii="Consolas" w:cs="Consolas" w:eastAsia="Consolas" w:hAnsi="Consolas"/>
@@ -4082,22 +4154,10 @@
           <w:szCs w:val="20"/>
           <w:shd w:fill="EEF1F4" w:val="clear"/>
         </w:rPr>
-        <w:t xml:space="preserve">POST /api/config/import</w:t>
-      </w:r>
-    </w:p>
-    <w:p>
-      <w:pPr>
-        <w:spacing w:after="140" w:line="300"/>
-      </w:pPr>
-      <w:r>
-        <w:rPr>
-          <w:b/>
-          <w:bCs/>
-        </w:rPr>
-        <w:t xml:space="preserve">Auth:</w:t>
-      </w:r>
-      <w:r>
-        <w:t xml:space="preserve"> Bearer token required. Body: the site's configuration (</w:t>
+        <w:t xml:space="preserve">silos</w:t>
+      </w:r>
+      <w:r>
+        <w:t xml:space="preserve">). Accepted only when SiloCentral has no configuration for the site or an admin requested a re-import and the site is not managed. Responds </w:t>
       </w:r>
       <w:r>
         <w:rPr>
@@ -4106,10 +4166,10 @@
           <w:szCs w:val="20"/>
           <w:shd w:fill="EEF1F4" w:val="clear"/>
         </w:rPr>
-        <w:t xml:space="preserve">pages</w:t>
-      </w:r>
-      <w:r>
-        <w:t xml:space="preserve">, </w:t>
+        <w:t xml:space="preserve">{ "ok": true, "version": N }</w:t>
+      </w:r>
+      <w:r>
+        <w:t xml:space="preserve">; </w:t>
       </w:r>
       <w:r>
         <w:rPr>
@@ -4118,10 +4178,10 @@
           <w:szCs w:val="20"/>
           <w:shd w:fill="EEF1F4" w:val="clear"/>
         </w:rPr>
-        <w:t xml:space="preserve">silos</w:t>
-      </w:r>
-      <w:r>
-        <w:t xml:space="preserve">). Accepted only when SiloCentral has no configuration for the site or an admin requested a re-import and the site is not managed. Responds </w:t>
+        <w:t xml:space="preserve">400</w:t>
+      </w:r>
+      <w:r>
+        <w:t xml:space="preserve"> for an invalid document, </w:t>
       </w:r>
       <w:r>
         <w:rPr>
@@ -4130,10 +4190,41 @@
           <w:szCs w:val="20"/>
           <w:shd w:fill="EEF1F4" w:val="clear"/>
         </w:rPr>
-        <w:t xml:space="preserve">{ "ok": true, "version": N }</w:t>
-      </w:r>
-      <w:r>
-        <w:t xml:space="preserve">; </w:t>
+        <w:t xml:space="preserve">409</w:t>
+      </w:r>
+      <w:r>
+        <w:t xml:space="preserve"> if an import was not requested.</w:t>
+      </w:r>
+    </w:p>
+    <w:p>
+      <w:pPr>
+        <w:pStyle w:val="Heading3"/>
+        <w:spacing w:after="120" w:before="280"/>
+      </w:pPr>
+      <w:r>
+        <w:rPr>
+          <w:rFonts w:ascii="Consolas" w:cs="Consolas" w:eastAsia="Consolas" w:hAnsi="Consolas"/>
+          <w:b/>
+          <w:bCs/>
+          <w:sz w:val="24"/>
+          <w:szCs w:val="24"/>
+        </w:rPr>
+        <w:t xml:space="preserve">POST /api/config/ack</w:t>
+      </w:r>
+    </w:p>
+    <w:p>
+      <w:pPr>
+        <w:spacing w:after="140" w:line="300"/>
+      </w:pPr>
+      <w:r>
+        <w:rPr>
+          <w:b/>
+          <w:bCs/>
+        </w:rPr>
+        <w:t xml:space="preserve">Auth:</w:t>
+      </w:r>
+      <w:r>
+        <w:t xml:space="preserve"> Bearer token required. Body: </w:t>
       </w:r>
       <w:r>
         <w:rPr>
@@ -4142,10 +4233,10 @@
           <w:szCs w:val="20"/>
           <w:shd w:fill="EEF1F4" w:val="clear"/>
         </w:rPr>
-        <w:t xml:space="preserve">400</w:t>
-      </w:r>
-      <w:r>
-        <w:t xml:space="preserve"> for an invalid document, </w:t>
+        <w:t xml:space="preserve">{ "version": 11, "ok": true }</w:t>
+      </w:r>
+      <w:r>
+        <w:t xml:space="preserve"> or </w:t>
       </w:r>
       <w:r>
         <w:rPr>
@@ -4154,17 +4245,11 @@
           <w:szCs w:val="20"/>
           <w:shd w:fill="EEF1F4" w:val="clear"/>
         </w:rPr>
-        <w:t xml:space="preserve">409</w:t>
-      </w:r>
-      <w:r>
-        <w:t xml:space="preserve"> if an import was not requested.</w:t>
-      </w:r>
-    </w:p>
-    <w:p>
-      <w:pPr>
-        <w:pStyle w:val="Heading3"/>
-        <w:spacing w:after="120" w:before="280"/>
-      </w:pPr>
+        <w:t xml:space="preserve">{ "version": 11, "ok": false, "error": "why it failed" }</w:t>
+      </w:r>
+      <w:r>
+        <w:t xml:space="preserve">. Responds </w:t>
+      </w:r>
       <w:r>
         <w:rPr>
           <w:rFonts w:ascii="Consolas" w:cs="Consolas" w:eastAsia="Consolas" w:hAnsi="Consolas"/>
@@ -4172,22 +4257,10 @@
           <w:szCs w:val="20"/>
           <w:shd w:fill="EEF1F4" w:val="clear"/>
         </w:rPr>
-        <w:t xml:space="preserve">POST /api/config/ack</w:t>
-      </w:r>
-    </w:p>
-    <w:p>
-      <w:pPr>
-        <w:spacing w:after="140" w:line="300"/>
-      </w:pPr>
-      <w:r>
-        <w:rPr>
-          <w:b/>
-          <w:bCs/>
-        </w:rPr>
-        <w:t xml:space="preserve">Auth:</w:t>
-      </w:r>
-      <w:r>
-        <w:t xml:space="preserve"> Bearer token required. Body: </w:t>
+        <w:t xml:space="preserve">{ "ok": true }</w:t>
+      </w:r>
+      <w:r>
+        <w:t xml:space="preserve">; </w:t>
       </w:r>
       <w:r>
         <w:rPr>
@@ -4196,42 +4269,6 @@
           <w:szCs w:val="20"/>
           <w:shd w:fill="EEF1F4" w:val="clear"/>
         </w:rPr>
-        <w:t xml:space="preserve">{ "version": 11, "ok": true }</w:t>
-      </w:r>
-      <w:r>
-        <w:t xml:space="preserve"> or </w:t>
-      </w:r>
-      <w:r>
-        <w:rPr>
-          <w:rFonts w:ascii="Consolas" w:cs="Consolas" w:eastAsia="Consolas" w:hAnsi="Consolas"/>
-          <w:sz w:val="20"/>
-          <w:szCs w:val="20"/>
-          <w:shd w:fill="EEF1F4" w:val="clear"/>
-        </w:rPr>
-        <w:t xml:space="preserve">{ "version": 11, "ok": false, "error": "why it failed" }</w:t>
-      </w:r>
-      <w:r>
-        <w:t xml:space="preserve">. Responds </w:t>
-      </w:r>
-      <w:r>
-        <w:rPr>
-          <w:rFonts w:ascii="Consolas" w:cs="Consolas" w:eastAsia="Consolas" w:hAnsi="Consolas"/>
-          <w:sz w:val="20"/>
-          <w:szCs w:val="20"/>
-          <w:shd w:fill="EEF1F4" w:val="clear"/>
-        </w:rPr>
-        <w:t xml:space="preserve">{ "ok": true }</w:t>
-      </w:r>
-      <w:r>
-        <w:t xml:space="preserve">; </w:t>
-      </w:r>
-      <w:r>
-        <w:rPr>
-          <w:rFonts w:ascii="Consolas" w:cs="Consolas" w:eastAsia="Consolas" w:hAnsi="Consolas"/>
-          <w:sz w:val="20"/>
-          <w:szCs w:val="20"/>
-          <w:shd w:fill="EEF1F4" w:val="clear"/>
-        </w:rPr>
         <w:t xml:space="preserve">400</w:t>
       </w:r>
       <w:r>
@@ -4244,6 +4281,12 @@
         <w:spacing w:after="120" w:before="280"/>
       </w:pPr>
       <w:r>
+        <w:rPr>
+          <w:b/>
+          <w:bCs/>
+          <w:sz w:val="30"/>
+          <w:szCs w:val="30"/>
+        </w:rPr>
         <w:t xml:space="preserve">The report shape</w:t>
       </w:r>
     </w:p>
@@ -4261,6 +4304,12 @@
         <w:spacing w:after="120" w:before="280"/>
       </w:pPr>
       <w:r>
+        <w:rPr>
+          <w:b/>
+          <w:bCs/>
+          <w:sz w:val="24"/>
+          <w:szCs w:val="24"/>
+        </w:rPr>
         <w:t xml:space="preserve">Top level</w:t>
       </w:r>
     </w:p>
@@ -4895,6 +4944,12 @@
         <w:spacing w:after="120" w:before="280"/>
       </w:pPr>
       <w:r>
+        <w:rPr>
+          <w:b/>
+          <w:bCs/>
+          <w:sz w:val="24"/>
+          <w:szCs w:val="24"/>
+        </w:rPr>
         <w:t xml:space="preserve">Each silo</w:t>
       </w:r>
     </w:p>
@@ -5829,6 +5884,12 @@
         <w:spacing w:after="120" w:before="280"/>
       </w:pPr>
       <w:r>
+        <w:rPr>
+          <w:b/>
+          <w:bCs/>
+          <w:sz w:val="24"/>
+          <w:szCs w:val="24"/>
+        </w:rPr>
         <w:t xml:space="preserve">Status enum</w:t>
       </w:r>
     </w:p>

</xml_diff>